<commit_message>
Update public documents for v3.1.
</commit_message>
<xml_diff>
--- a/public/downloads/3.1/MiniBIM ILS v3.1 - deel A.docx
+++ b/public/downloads/3.1/MiniBIM ILS v3.1 - deel A.docx
@@ -3768,7 +3768,6 @@
         </w:rPr>
         <w:t>(</w:t>
       </w:r>
-      <w:proofErr w:type="spellStart"/>
       <w:r>
         <w:rPr>
           <w:i/>
@@ -3785,7 +3784,6 @@
         </w:rPr>
         <w:t>SpaceBaseQuantities</w:t>
       </w:r>
-      <w:proofErr w:type="spellEnd"/>
       <w:r>
         <w:rPr>
           <w:i/>
@@ -3801,97 +3799,48 @@
         <w:spacing w:line="240" w:lineRule="auto"/>
         <w:rPr>
           <w:color w:val="000000" w:themeColor="text1"/>
-          <w:lang w:val="en-GB"/>
-        </w:rPr>
-      </w:pPr>
+        </w:rPr>
+      </w:pPr>
+      <w:r>
+        <w:t xml:space="preserve">Exporteer een </w:t>
+      </w:r>
       <w:proofErr w:type="spellStart"/>
       <w:r>
-        <w:rPr>
-          <w:lang w:val="en-GB"/>
-        </w:rPr>
-        <w:t>Exporteer</w:t>
+        <w:t>Ifc</w:t>
       </w:r>
       <w:proofErr w:type="spellEnd"/>
       <w:r>
-        <w:rPr>
-          <w:lang w:val="en-GB"/>
-        </w:rPr>
-        <w:t xml:space="preserve"> </w:t>
+        <w:t xml:space="preserve"> met de </w:t>
       </w:r>
       <w:proofErr w:type="spellStart"/>
       <w:r>
-        <w:rPr>
-          <w:lang w:val="en-GB"/>
-        </w:rPr>
-        <w:t>een</w:t>
+        <w:t>custom</w:t>
       </w:r>
       <w:proofErr w:type="spellEnd"/>
       <w:r>
-        <w:rPr>
-          <w:lang w:val="en-GB"/>
-        </w:rPr>
-        <w:t xml:space="preserve"> </w:t>
-      </w:r>
-      <w:proofErr w:type="spellStart"/>
-      <w:r>
-        <w:rPr>
-          <w:lang w:val="en-GB"/>
-        </w:rPr>
-        <w:t>Ifc</w:t>
-      </w:r>
-      <w:proofErr w:type="spellEnd"/>
-      <w:r>
-        <w:rPr>
-          <w:lang w:val="en-GB"/>
-        </w:rPr>
-        <w:t xml:space="preserve"> met de custom property set </w:t>
-      </w:r>
-      <w:r>
-        <w:rPr>
-          <w:lang w:val="en-GB"/>
-        </w:rPr>
+        <w:t xml:space="preserve"> property set </w:t>
+      </w:r>
+      <w:r>
         <w:t>MiniBIM ILS</w:t>
       </w:r>
       <w:r>
-        <w:rPr>
-          <w:lang w:val="en-GB"/>
-        </w:rPr>
         <w:t xml:space="preserve"> met de</w:t>
       </w:r>
       <w:r>
         <w:rPr>
           <w:color w:val="000000" w:themeColor="text1"/>
-          <w:lang w:val="en-GB"/>
-        </w:rPr>
-        <w:t xml:space="preserve"> </w:t>
-      </w:r>
-      <w:proofErr w:type="spellStart"/>
+        </w:rPr>
+        <w:t xml:space="preserve"> volgende </w:t>
+      </w:r>
       <w:r>
         <w:rPr>
           <w:color w:val="000000" w:themeColor="text1"/>
-          <w:lang w:val="en-GB"/>
-        </w:rPr>
-        <w:t>volgende</w:t>
-      </w:r>
-      <w:proofErr w:type="spellEnd"/>
+        </w:rPr>
+        <w:t>parameters</w:t>
+      </w:r>
       <w:r>
         <w:rPr>
           <w:color w:val="000000" w:themeColor="text1"/>
-          <w:lang w:val="en-GB"/>
-        </w:rPr>
-        <w:t xml:space="preserve"> </w:t>
-      </w:r>
-      <w:r>
-        <w:rPr>
-          <w:color w:val="000000" w:themeColor="text1"/>
-          <w:lang w:val="en-GB"/>
-        </w:rPr>
-        <w:t>parameters</w:t>
-      </w:r>
-      <w:r>
-        <w:rPr>
-          <w:color w:val="000000" w:themeColor="text1"/>
-          <w:lang w:val="en-GB"/>
         </w:rPr>
         <w:t>:</w:t>
       </w:r>
@@ -4627,7 +4576,16 @@
         <w:t xml:space="preserve">. </w:t>
       </w:r>
       <w:r>
-        <w:t>Ruimten dienen aansluitend gemodelleerd te worden zonder overlappingen.</w:t>
+        <w:t xml:space="preserve">Ruimten </w:t>
+      </w:r>
+      <w:r>
+        <w:t>met een andere Bepalingsmethode kunnen wel overlappen.</w:t>
+      </w:r>
+      <w:r>
+        <w:t xml:space="preserve"> Ruimten met Bepalingsmethode BVO </w:t>
+      </w:r>
+      <w:r>
+        <w:t>dienen aansluitend gemodelleerd te worden zonder overlappingen.</w:t>
       </w:r>
     </w:p>
     <w:p>
@@ -5011,9 +4969,55 @@
         <w:pStyle w:val="VormHoofdtekst"/>
       </w:pPr>
       <w:r>
+        <w:t xml:space="preserve">Uitgebreide </w:t>
+      </w:r>
+      <w:r>
+        <w:t>informatie</w:t>
+      </w:r>
+      <w:r>
+        <w:t xml:space="preserve"> </w:t>
+      </w:r>
+      <w:r>
+        <w:t xml:space="preserve">over Georefereren is te vinden op de GitHub van </w:t>
+      </w:r>
+      <w:proofErr w:type="spellStart"/>
+      <w:r>
+        <w:t>Geonovum</w:t>
+      </w:r>
+      <w:proofErr w:type="spellEnd"/>
+      <w:r>
+        <w:t>:</w:t>
+      </w:r>
+    </w:p>
+    <w:p>
+      <w:pPr>
+        <w:pStyle w:val="VormHoofdtekst"/>
+      </w:pPr>
+      <w:hyperlink r:id="rId17" w:history="1">
+        <w:r>
+          <w:rPr>
+            <w:rStyle w:val="Hyperlink"/>
+          </w:rPr>
+          <w:t xml:space="preserve">Georefereren </w:t>
+        </w:r>
+        <w:proofErr w:type="spellStart"/>
+        <w:r>
+          <w:rPr>
+            <w:rStyle w:val="Hyperlink"/>
+          </w:rPr>
+          <w:t>GeoBIM</w:t>
+        </w:r>
+        <w:proofErr w:type="spellEnd"/>
+      </w:hyperlink>
+    </w:p>
+    <w:p>
+      <w:pPr>
+        <w:pStyle w:val="VormHoofdtekst"/>
+      </w:pPr>
+      <w:r>
         <w:t xml:space="preserve">Door een </w:t>
       </w:r>
-      <w:hyperlink r:id="rId17" w:history="1">
+      <w:hyperlink r:id="rId18" w:history="1">
         <w:r>
           <w:rPr>
             <w:rStyle w:val="Hyperlink"/>
@@ -5079,13 +5083,13 @@
           <w:noProof/>
         </w:rPr>
         <w:drawing>
-          <wp:anchor distT="0" distB="0" distL="114300" distR="114300" simplePos="0" relativeHeight="251658241" behindDoc="1" locked="0" layoutInCell="1" allowOverlap="1" wp14:anchorId="647100CD" wp14:editId="1E790475">
+          <wp:anchor distT="0" distB="0" distL="114300" distR="114300" simplePos="0" relativeHeight="251658241" behindDoc="1" locked="0" layoutInCell="1" allowOverlap="1" wp14:anchorId="647100CD" wp14:editId="63B854A2">
             <wp:simplePos x="0" y="0"/>
             <wp:positionH relativeFrom="page">
-              <wp:posOffset>3096260</wp:posOffset>
+              <wp:align>center</wp:align>
             </wp:positionH>
             <wp:positionV relativeFrom="page">
-              <wp:posOffset>7394109</wp:posOffset>
+              <wp:posOffset>7884795</wp:posOffset>
             </wp:positionV>
             <wp:extent cx="1368000" cy="1530000"/>
             <wp:effectExtent l="0" t="0" r="0" b="0"/>
@@ -5104,7 +5108,7 @@
                     </pic:cNvPicPr>
                   </pic:nvPicPr>
                   <pic:blipFill>
-                    <a:blip r:embed="rId18" cstate="print">
+                    <a:blip r:embed="rId19" cstate="print">
                       <a:extLst>
                         <a:ext uri="{28A0092B-C50C-407E-A947-70E740481C1C}">
                           <a14:useLocalDpi xmlns:a14="http://schemas.microsoft.com/office/drawing/2010/main" val="0"/>
@@ -6271,13 +6275,13 @@
           <w:lang w:val="en-GB"/>
         </w:rPr>
         <w:drawing>
-          <wp:anchor distT="0" distB="0" distL="114300" distR="114300" simplePos="0" relativeHeight="251658245" behindDoc="1" locked="0" layoutInCell="1" allowOverlap="1" wp14:anchorId="2106ED29" wp14:editId="578D5979">
+          <wp:anchor distT="0" distB="0" distL="114300" distR="114300" simplePos="0" relativeHeight="251658245" behindDoc="1" locked="0" layoutInCell="1" allowOverlap="1" wp14:anchorId="2106ED29" wp14:editId="212D6935">
             <wp:simplePos x="0" y="0"/>
             <wp:positionH relativeFrom="page">
-              <wp:posOffset>1057275</wp:posOffset>
+              <wp:posOffset>990600</wp:posOffset>
             </wp:positionH>
             <wp:positionV relativeFrom="paragraph">
-              <wp:posOffset>91757</wp:posOffset>
+              <wp:posOffset>278765</wp:posOffset>
             </wp:positionV>
             <wp:extent cx="5607685" cy="2747645"/>
             <wp:effectExtent l="0" t="0" r="0" b="0"/>
@@ -6293,16 +6297,18 @@
                     <pic:cNvPr id="1671240798" name="Afbeelding 1"/>
                     <pic:cNvPicPr/>
                   </pic:nvPicPr>
-                  <pic:blipFill rotWithShape="1">
-                    <a:blip r:embed="rId19" cstate="print">
+                  <pic:blipFill>
+                    <a:blip r:embed="rId20" cstate="print">
                       <a:extLst>
                         <a:ext uri="{28A0092B-C50C-407E-A947-70E740481C1C}">
                           <a14:useLocalDpi xmlns:a14="http://schemas.microsoft.com/office/drawing/2010/main" val="0"/>
                         </a:ext>
                       </a:extLst>
                     </a:blip>
-                    <a:srcRect t="324" b="6835"/>
-                    <a:stretch/>
+                    <a:srcRect t="7432" b="7432"/>
+                    <a:stretch>
+                      <a:fillRect/>
+                    </a:stretch>
                   </pic:blipFill>
                   <pic:spPr bwMode="auto">
                     <a:xfrm>
@@ -6417,7 +6423,7 @@
           <w:highlight w:val="yellow"/>
         </w:rPr>
         <w:drawing>
-          <wp:anchor distT="0" distB="0" distL="114300" distR="114300" simplePos="0" relativeHeight="251658243" behindDoc="1" locked="0" layoutInCell="1" allowOverlap="1" wp14:anchorId="3DB26DF4" wp14:editId="48C18C3D">
+          <wp:anchor distT="0" distB="0" distL="114300" distR="114300" simplePos="0" relativeHeight="251658243" behindDoc="1" locked="0" layoutInCell="1" allowOverlap="1" wp14:anchorId="3DB26DF4" wp14:editId="57DE23FA">
             <wp:simplePos x="0" y="0"/>
             <wp:positionH relativeFrom="page">
               <wp:align>center</wp:align>
@@ -6440,7 +6446,7 @@
                     <pic:cNvPicPr/>
                   </pic:nvPicPr>
                   <pic:blipFill>
-                    <a:blip r:embed="rId20" cstate="print">
+                    <a:blip r:embed="rId21" cstate="print">
                       <a:extLst>
                         <a:ext uri="{28A0092B-C50C-407E-A947-70E740481C1C}">
                           <a14:useLocalDpi xmlns:a14="http://schemas.microsoft.com/office/drawing/2010/main" val="0"/>
@@ -6627,7 +6633,7 @@
           <w:noProof/>
         </w:rPr>
         <w:drawing>
-          <wp:anchor distT="0" distB="0" distL="114300" distR="114300" simplePos="0" relativeHeight="251658244" behindDoc="1" locked="0" layoutInCell="1" allowOverlap="1" wp14:anchorId="56F51A31" wp14:editId="58AEE62F">
+          <wp:anchor distT="0" distB="0" distL="114300" distR="114300" simplePos="0" relativeHeight="251658244" behindDoc="1" locked="0" layoutInCell="1" allowOverlap="1" wp14:anchorId="56F51A31" wp14:editId="3058C083">
             <wp:simplePos x="0" y="0"/>
             <wp:positionH relativeFrom="page">
               <wp:posOffset>2701925</wp:posOffset>
@@ -6650,7 +6656,7 @@
                     <pic:cNvPicPr/>
                   </pic:nvPicPr>
                   <pic:blipFill>
-                    <a:blip r:embed="rId21" cstate="print">
+                    <a:blip r:embed="rId22" cstate="print">
                       <a:extLst>
                         <a:ext uri="{28A0092B-C50C-407E-A947-70E740481C1C}">
                           <a14:useLocalDpi xmlns:a14="http://schemas.microsoft.com/office/drawing/2010/main" val="0"/>
@@ -7170,7 +7176,7 @@
       <w:r>
         <w:t xml:space="preserve">Zie voor meer parameterexpressies de </w:t>
       </w:r>
-      <w:hyperlink r:id="rId22" w:history="1">
+      <w:hyperlink r:id="rId23" w:history="1">
         <w:proofErr w:type="spellStart"/>
         <w:r>
           <w:rPr>
@@ -7220,7 +7226,7 @@
           <w:lang w:val="en-GB"/>
         </w:rPr>
       </w:pPr>
-      <w:hyperlink r:id="rId23" w:history="1">
+      <w:hyperlink r:id="rId24" w:history="1">
         <w:r>
           <w:rPr>
             <w:rStyle w:val="Hyperlink"/>
@@ -7298,7 +7304,7 @@
         </w:rPr>
         <w:fldChar w:fldCharType="end"/>
       </w:r>
-      <w:hyperlink r:id="rId24" w:history="1">
+      <w:hyperlink r:id="rId25" w:history="1">
         <w:proofErr w:type="spellStart"/>
         <w:r>
           <w:rPr>
@@ -7460,7 +7466,7 @@
                     </pic:cNvPicPr>
                   </pic:nvPicPr>
                   <pic:blipFill>
-                    <a:blip r:embed="rId25" cstate="print">
+                    <a:blip r:embed="rId26" cstate="print">
                       <a:extLst>
                         <a:ext uri="{28A0092B-C50C-407E-A947-70E740481C1C}">
                           <a14:useLocalDpi xmlns:a14="http://schemas.microsoft.com/office/drawing/2010/main" val="0"/>
@@ -7549,7 +7555,7 @@
                     <pic:cNvPicPr/>
                   </pic:nvPicPr>
                   <pic:blipFill>
-                    <a:blip r:embed="rId26" cstate="print">
+                    <a:blip r:embed="rId27" cstate="print">
                       <a:extLst>
                         <a:ext uri="{28A0092B-C50C-407E-A947-70E740481C1C}">
                           <a14:useLocalDpi xmlns:a14="http://schemas.microsoft.com/office/drawing/2010/main" val="0"/>
@@ -7789,7 +7795,7 @@
                     <pic:cNvPicPr/>
                   </pic:nvPicPr>
                   <pic:blipFill>
-                    <a:blip r:embed="rId27" cstate="print">
+                    <a:blip r:embed="rId28" cstate="print">
                       <a:extLst>
                         <a:ext uri="{28A0092B-C50C-407E-A947-70E740481C1C}">
                           <a14:useLocalDpi xmlns:a14="http://schemas.microsoft.com/office/drawing/2010/main" val="0"/>
@@ -8041,10 +8047,10 @@
       <w:pPr>
         <w:pStyle w:val="VormHoofdtekst"/>
         <w:sectPr>
-          <w:headerReference w:type="default" r:id="rId28"/>
-          <w:footerReference w:type="default" r:id="rId29"/>
-          <w:headerReference w:type="first" r:id="rId30"/>
-          <w:footerReference w:type="first" r:id="rId31"/>
+          <w:headerReference w:type="default" r:id="rId29"/>
+          <w:footerReference w:type="default" r:id="rId30"/>
+          <w:headerReference w:type="first" r:id="rId31"/>
+          <w:footerReference w:type="first" r:id="rId32"/>
           <w:pgSz w:w="11906" w:h="16838" w:code="9"/>
           <w:pgMar w:top="1871" w:right="1134" w:bottom="1418" w:left="1701" w:header="510" w:footer="283" w:gutter="0"/>
           <w:cols w:space="708"/>
@@ -8130,7 +8136,7 @@
             <w:r>
               <w:t xml:space="preserve"> </w:t>
             </w:r>
-            <w:hyperlink r:id="rId32" w:history="1">
+            <w:hyperlink r:id="rId33" w:history="1">
               <w:r>
                 <w:rPr>
                   <w:rStyle w:val="Hyperlink"/>
@@ -8157,7 +8163,7 @@
             <w:r>
               <w:t xml:space="preserve"> </w:t>
             </w:r>
-            <w:hyperlink r:id="rId33" w:history="1">
+            <w:hyperlink r:id="rId34" w:history="1">
               <w:r>
                 <w:rPr>
                   <w:rStyle w:val="Hyperlink"/>
@@ -8185,7 +8191,7 @@
             <w:r>
               <w:t xml:space="preserve"> </w:t>
             </w:r>
-            <w:hyperlink r:id="rId34" w:history="1">
+            <w:hyperlink r:id="rId35" w:history="1">
               <w:r>
                 <w:rPr>
                   <w:rStyle w:val="Hyperlink"/>
@@ -8207,8 +8213,8 @@
     </w:tbl>
     <w:p/>
     <w:sectPr>
-      <w:headerReference w:type="first" r:id="rId35"/>
-      <w:footerReference w:type="first" r:id="rId36"/>
+      <w:headerReference w:type="first" r:id="rId36"/>
+      <w:footerReference w:type="first" r:id="rId37"/>
       <w:pgSz w:w="11906" w:h="16838" w:code="9"/>
       <w:pgMar w:top="1871" w:right="1134" w:bottom="1418" w:left="1701" w:header="539" w:footer="454" w:gutter="0"/>
       <w:cols w:space="708"/>
@@ -8364,7 +8370,7 @@
       <mc:AlternateContent>
         <mc:Choice Requires="wps">
           <w:drawing>
-            <wp:anchor distT="0" distB="0" distL="114300" distR="114300" simplePos="0" relativeHeight="251657728" behindDoc="0" locked="0" layoutInCell="1" allowOverlap="1" wp14:anchorId="6CE6C058" wp14:editId="762CA834">
+            <wp:anchor distT="0" distB="0" distL="114300" distR="114300" simplePos="0" relativeHeight="251658243" behindDoc="0" locked="0" layoutInCell="1" allowOverlap="1" wp14:anchorId="6CE6C058" wp14:editId="762CA834">
               <wp:simplePos x="0" y="0"/>
               <wp:positionH relativeFrom="page">
                 <wp:posOffset>1058349</wp:posOffset>
@@ -8419,7 +8425,7 @@
         </mc:Choice>
         <mc:Fallback>
           <w:pict>
-            <v:line w14:anchorId="3B1C47CE" id="Straight Connector 5" o:spid="_x0000_s1026" style="position:absolute;z-index:251657728;visibility:visible;mso-wrap-style:square;mso-width-percent:0;mso-height-percent:0;mso-wrap-distance-left:9pt;mso-wrap-distance-top:0;mso-wrap-distance-right:9pt;mso-wrap-distance-bottom:0;mso-position-horizontal:absolute;mso-position-horizontal-relative:page;mso-position-vertical:absolute;mso-position-vertical-relative:page;mso-width-percent:0;mso-height-percent:0;mso-width-relative:margin;mso-height-relative:margin" from="83.35pt,800.1pt" to="536.25pt,801.4pt" o:gfxdata="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" strokecolor="#005496 [3204]" strokeweight=".5pt">
+            <v:line w14:anchorId="32B272B3" id="Straight Connector 5" o:spid="_x0000_s1026" style="position:absolute;z-index:251658243;visibility:visible;mso-wrap-style:square;mso-width-percent:0;mso-height-percent:0;mso-wrap-distance-left:9pt;mso-wrap-distance-top:0;mso-wrap-distance-right:9pt;mso-wrap-distance-bottom:0;mso-position-horizontal:absolute;mso-position-horizontal-relative:page;mso-position-vertical:absolute;mso-position-vertical-relative:page;mso-width-percent:0;mso-height-percent:0;mso-width-relative:margin;mso-height-relative:margin" from="83.35pt,800.1pt" to="536.25pt,801.4pt" o:gfxdata="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" strokecolor="#005496 [3204]" strokeweight=".5pt">
               <v:stroke joinstyle="miter"/>
               <w10:wrap anchorx="page" anchory="page"/>
             </v:line>
@@ -8501,7 +8507,7 @@
         </mc:Choice>
         <mc:Fallback>
           <w:pict>
-            <v:line w14:anchorId="3DF66EA2" id="Straight Connector 5" o:spid="_x0000_s1026" style="position:absolute;z-index:251658240;visibility:visible;mso-wrap-style:square;mso-width-percent:0;mso-wrap-distance-left:9pt;mso-wrap-distance-top:0;mso-wrap-distance-right:9pt;mso-wrap-distance-bottom:0;mso-position-horizontal:absolute;mso-position-horizontal-relative:page;mso-position-vertical:absolute;mso-position-vertical-relative:page;mso-width-percent:0;mso-width-relative:margin" from="56.7pt,789.55pt" to="538.6pt,789.55pt" o:gfxdata="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" strokecolor="#005496 [3204]" strokeweight=".5pt">
+            <v:line w14:anchorId="0A774BF5" id="Straight Connector 5" o:spid="_x0000_s1026" style="position:absolute;z-index:251658240;visibility:visible;mso-wrap-style:square;mso-width-percent:0;mso-wrap-distance-left:9pt;mso-wrap-distance-top:0;mso-wrap-distance-right:9pt;mso-wrap-distance-bottom:0;mso-position-horizontal:absolute;mso-position-horizontal-relative:page;mso-position-vertical:absolute;mso-position-vertical-relative:page;mso-width-percent:0;mso-width-relative:margin" from="56.7pt,789.55pt" to="538.6pt,789.55pt" o:gfxdata="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" strokecolor="#005496 [3204]" strokeweight=".5pt">
               <v:stroke joinstyle="miter"/>
               <w10:wrap anchorx="page" anchory="page"/>
             </v:line>
@@ -8639,7 +8645,7 @@
     </w:pPr>
     <w:r>
       <w:drawing>
-        <wp:anchor distT="0" distB="0" distL="114300" distR="114300" simplePos="0" relativeHeight="251658752" behindDoc="1" locked="0" layoutInCell="1" allowOverlap="1" wp14:anchorId="2F8BDDF2" wp14:editId="6356EC97">
+        <wp:anchor distT="0" distB="0" distL="114300" distR="114300" simplePos="0" relativeHeight="251658244" behindDoc="1" locked="0" layoutInCell="1" allowOverlap="1" wp14:anchorId="2F8BDDF2" wp14:editId="6356EC97">
           <wp:simplePos x="0" y="0"/>
           <wp:positionH relativeFrom="page">
             <wp:align>center</wp:align>
@@ -8776,7 +8782,7 @@
         </mc:Choice>
         <mc:Fallback>
           <w:pict>
-            <v:rect w14:anchorId="70A7F09F" id="Rectangle 9" o:spid="_x0000_s1026" style="position:absolute;margin-left:0;margin-top:0;width:595.3pt;height:841.9pt;z-index:251658241;visibility:visible;mso-wrap-style:square;mso-width-percent:0;mso-height-percent:0;mso-wrap-distance-left:9pt;mso-wrap-distance-top:0;mso-wrap-distance-right:9pt;mso-wrap-distance-bottom:0;mso-position-horizontal:left;mso-position-horizontal-relative:page;mso-position-vertical:top;mso-position-vertical-relative:page;mso-width-percent:0;mso-height-percent:0;mso-width-relative:margin;mso-height-relative:margin;v-text-anchor:middle" o:gfxdata="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" fillcolor="#005496 [3204]" stroked="f" strokeweight="1pt">
+            <v:rect w14:anchorId="2F4C70E0" id="Rectangle 9" o:spid="_x0000_s1026" style="position:absolute;margin-left:0;margin-top:0;width:595.3pt;height:841.9pt;z-index:251658241;visibility:visible;mso-wrap-style:square;mso-width-percent:0;mso-height-percent:0;mso-wrap-distance-left:9pt;mso-wrap-distance-top:0;mso-wrap-distance-right:9pt;mso-wrap-distance-bottom:0;mso-position-horizontal:left;mso-position-horizontal-relative:page;mso-position-vertical:top;mso-position-vertical-relative:page;mso-width-percent:0;mso-height-percent:0;mso-width-relative:margin;mso-height-relative:margin;v-text-anchor:middle" o:gfxdata="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" fillcolor="#005496 [3204]" stroked="f" strokeweight="1pt">
               <w10:wrap anchorx="page" anchory="page"/>
             </v:rect>
           </w:pict>
@@ -13135,16 +13141,21 @@
     <w:rsid w:val="002F4668"/>
     <w:rsid w:val="00301A28"/>
     <w:rsid w:val="0034249C"/>
+    <w:rsid w:val="003549D4"/>
     <w:rsid w:val="003777C6"/>
     <w:rsid w:val="003B5FF2"/>
     <w:rsid w:val="003C74C7"/>
+    <w:rsid w:val="003D32C0"/>
     <w:rsid w:val="0042070F"/>
+    <w:rsid w:val="00450C1E"/>
+    <w:rsid w:val="004736BF"/>
     <w:rsid w:val="00491D58"/>
     <w:rsid w:val="004F44D6"/>
     <w:rsid w:val="0050150F"/>
     <w:rsid w:val="005266D5"/>
     <w:rsid w:val="005674AE"/>
     <w:rsid w:val="00573A3F"/>
+    <w:rsid w:val="005A3E5B"/>
     <w:rsid w:val="005A65CD"/>
     <w:rsid w:val="005B6443"/>
     <w:rsid w:val="00602C96"/>
@@ -13152,6 +13163,7 @@
     <w:rsid w:val="00685D07"/>
     <w:rsid w:val="00696695"/>
     <w:rsid w:val="006F5624"/>
+    <w:rsid w:val="00726379"/>
     <w:rsid w:val="00736EDE"/>
     <w:rsid w:val="00772259"/>
     <w:rsid w:val="00772818"/>
@@ -13160,6 +13172,7 @@
     <w:rsid w:val="007E7462"/>
     <w:rsid w:val="007F53C6"/>
     <w:rsid w:val="0081324D"/>
+    <w:rsid w:val="008367E1"/>
     <w:rsid w:val="00853E5F"/>
     <w:rsid w:val="008909DD"/>
     <w:rsid w:val="008A67D3"/>
@@ -13167,7 +13180,10 @@
     <w:rsid w:val="00916E65"/>
     <w:rsid w:val="00981253"/>
     <w:rsid w:val="009A27D8"/>
+    <w:rsid w:val="009E468C"/>
     <w:rsid w:val="00A31DF9"/>
+    <w:rsid w:val="00A35B35"/>
+    <w:rsid w:val="00A56BA9"/>
     <w:rsid w:val="00A93F24"/>
     <w:rsid w:val="00AB2C8C"/>
     <w:rsid w:val="00AB6BBB"/>
@@ -13175,10 +13191,12 @@
     <w:rsid w:val="00B363CE"/>
     <w:rsid w:val="00B5338F"/>
     <w:rsid w:val="00BA5D62"/>
+    <w:rsid w:val="00BB6314"/>
     <w:rsid w:val="00C00586"/>
     <w:rsid w:val="00C0779A"/>
     <w:rsid w:val="00C2605B"/>
     <w:rsid w:val="00C44743"/>
+    <w:rsid w:val="00CA4B33"/>
     <w:rsid w:val="00CE3B0F"/>
     <w:rsid w:val="00CF3A3F"/>
     <w:rsid w:val="00D0754F"/>
@@ -13186,9 +13204,12 @@
     <w:rsid w:val="00D57354"/>
     <w:rsid w:val="00DD423A"/>
     <w:rsid w:val="00DD5C4B"/>
+    <w:rsid w:val="00E13A2A"/>
     <w:rsid w:val="00E26162"/>
     <w:rsid w:val="00E358A2"/>
     <w:rsid w:val="00E52A82"/>
+    <w:rsid w:val="00E621FD"/>
+    <w:rsid w:val="00EF4CB9"/>
     <w:rsid w:val="00F3576D"/>
     <w:rsid w:val="00F94F7B"/>
     <w:rsid w:val="00FB1A64"/>
@@ -13874,8 +13895,32 @@
 </file>
 
 <file path=customXml/item1.xml><?xml version="1.0" encoding="utf-8"?>
-<ct:contentTypeSchema xmlns:ct="http://schemas.microsoft.com/office/2006/metadata/contentType" xmlns:ma="http://schemas.microsoft.com/office/2006/metadata/properties/metaAttributes" ct:_="" ma:_="" ma:contentTypeName="Document" ma:contentTypeID="0x01010019DCE98DC99693439864E0842C396A7E" ma:contentTypeVersion="13" ma:contentTypeDescription="Een nieuw document maken." ma:contentTypeScope="" ma:versionID="8a551be33ef1a4cbfddd8e6c5c0d5e2f">
-  <xsd:schema xmlns:xsd="http://www.w3.org/2001/XMLSchema" xmlns:xs="http://www.w3.org/2001/XMLSchema" xmlns:p="http://schemas.microsoft.com/office/2006/metadata/properties" xmlns:ns2="b7b3ff46-887a-48e8-bc41-4dde4d679916" xmlns:ns3="82151b75-111b-4cde-b66a-26bbd1d19664" targetNamespace="http://schemas.microsoft.com/office/2006/metadata/properties" ma:root="true" ma:fieldsID="4dcca315572e812433bc1e6e1dc59dda" ns2:_="" ns3:_="">
+<p:properties xmlns:p="http://schemas.microsoft.com/office/2006/metadata/properties" xmlns:xsi="http://www.w3.org/2001/XMLSchema-instance" xmlns:pc="http://schemas.microsoft.com/office/infopath/2007/PartnerControls">
+  <documentManagement>
+    <TaxCatchAll xmlns="82151b75-111b-4cde-b66a-26bbd1d19664" xsi:nil="true"/>
+    <lcf76f155ced4ddcb4097134ff3c332f xmlns="b7b3ff46-887a-48e8-bc41-4dde4d679916">
+      <Terms xmlns="http://schemas.microsoft.com/office/infopath/2007/PartnerControls"/>
+    </lcf76f155ced4ddcb4097134ff3c332f>
+  </documentManagement>
+</p:properties>
+</file>
+
+<file path=customXml/item2.xml><?xml version="1.0" encoding="utf-8"?>
+<b:Sources xmlns:b="http://schemas.openxmlformats.org/officeDocument/2006/bibliography" xmlns="http://schemas.openxmlformats.org/officeDocument/2006/bibliography" SelectedStyle="\APASixthEditionOfficeOnline.xsl" StyleName="APA" Version="6"/>
+</file>
+
+<file path=customXml/item3.xml><?xml version="1.0" encoding="utf-8"?>
+<?mso-contentType ?>
+<FormTemplates xmlns="http://schemas.microsoft.com/sharepoint/v3/contenttype/forms">
+  <Display>DocumentLibraryForm</Display>
+  <Edit>DocumentLibraryForm</Edit>
+  <New>DocumentLibraryForm</New>
+</FormTemplates>
+</file>
+
+<file path=customXml/item4.xml><?xml version="1.0" encoding="utf-8"?>
+<ct:contentTypeSchema xmlns:ct="http://schemas.microsoft.com/office/2006/metadata/contentType" xmlns:ma="http://schemas.microsoft.com/office/2006/metadata/properties/metaAttributes" ct:_="" ma:_="" ma:contentTypeName="Document" ma:contentTypeID="0x01010019DCE98DC99693439864E0842C396A7E" ma:contentTypeVersion="13" ma:contentTypeDescription="Een nieuw document maken." ma:contentTypeScope="" ma:versionID="9628148e315d59a7035ede42a83df7a0">
+  <xsd:schema xmlns:xsd="http://www.w3.org/2001/XMLSchema" xmlns:xs="http://www.w3.org/2001/XMLSchema" xmlns:p="http://schemas.microsoft.com/office/2006/metadata/properties" xmlns:ns2="b7b3ff46-887a-48e8-bc41-4dde4d679916" xmlns:ns3="82151b75-111b-4cde-b66a-26bbd1d19664" targetNamespace="http://schemas.microsoft.com/office/2006/metadata/properties" ma:root="true" ma:fieldsID="80782709877ce7bee6e45ad44ea07cb6" ns2:_="" ns3:_="">
     <xsd:import namespace="b7b3ff46-887a-48e8-bc41-4dde4d679916"/>
     <xsd:import namespace="82151b75-111b-4cde-b66a-26bbd1d19664"/>
     <xsd:element name="properties">
@@ -14090,32 +14135,35 @@
 </ct:contentTypeSchema>
 </file>
 
-<file path=customXml/item2.xml><?xml version="1.0" encoding="utf-8"?>
-<b:Sources xmlns:b="http://schemas.openxmlformats.org/officeDocument/2006/bibliography" xmlns="http://schemas.openxmlformats.org/officeDocument/2006/bibliography" SelectedStyle="\APASixthEditionOfficeOnline.xsl" StyleName="APA" Version="6"/>
+<file path=customXml/itemProps1.xml><?xml version="1.0" encoding="utf-8"?>
+<ds:datastoreItem xmlns:ds="http://schemas.openxmlformats.org/officeDocument/2006/customXml" ds:itemID="{4BD6B6CD-5E4A-472A-8346-5FC12C5382B7}">
+  <ds:schemaRefs>
+    <ds:schemaRef ds:uri="http://schemas.microsoft.com/office/2006/metadata/properties"/>
+    <ds:schemaRef ds:uri="http://schemas.microsoft.com/office/infopath/2007/PartnerControls"/>
+    <ds:schemaRef ds:uri="82151b75-111b-4cde-b66a-26bbd1d19664"/>
+    <ds:schemaRef ds:uri="b7b3ff46-887a-48e8-bc41-4dde4d679916"/>
+  </ds:schemaRefs>
+</ds:datastoreItem>
 </file>
 
-<file path=customXml/item3.xml><?xml version="1.0" encoding="utf-8"?>
-<p:properties xmlns:p="http://schemas.microsoft.com/office/2006/metadata/properties" xmlns:xsi="http://www.w3.org/2001/XMLSchema-instance" xmlns:pc="http://schemas.microsoft.com/office/infopath/2007/PartnerControls">
-  <documentManagement>
-    <TaxCatchAll xmlns="82151b75-111b-4cde-b66a-26bbd1d19664" xsi:nil="true"/>
-    <lcf76f155ced4ddcb4097134ff3c332f xmlns="b7b3ff46-887a-48e8-bc41-4dde4d679916">
-      <Terms xmlns="http://schemas.microsoft.com/office/infopath/2007/PartnerControls"/>
-    </lcf76f155ced4ddcb4097134ff3c332f>
-  </documentManagement>
-</p:properties>
+<file path=customXml/itemProps2.xml><?xml version="1.0" encoding="utf-8"?>
+<ds:datastoreItem xmlns:ds="http://schemas.openxmlformats.org/officeDocument/2006/customXml" ds:itemID="{88461FB1-FDEA-4B0C-B768-7A29B8582256}">
+  <ds:schemaRefs>
+    <ds:schemaRef ds:uri="http://schemas.openxmlformats.org/officeDocument/2006/bibliography"/>
+  </ds:schemaRefs>
+</ds:datastoreItem>
 </file>
 
-<file path=customXml/item4.xml><?xml version="1.0" encoding="utf-8"?>
-<?mso-contentType ?>
-<FormTemplates xmlns="http://schemas.microsoft.com/sharepoint/v3/contenttype/forms">
-  <Display>DocumentLibraryForm</Display>
-  <Edit>DocumentLibraryForm</Edit>
-  <New>DocumentLibraryForm</New>
-</FormTemplates>
+<file path=customXml/itemProps3.xml><?xml version="1.0" encoding="utf-8"?>
+<ds:datastoreItem xmlns:ds="http://schemas.openxmlformats.org/officeDocument/2006/customXml" ds:itemID="{179FC9BC-D3BE-4788-8B0A-0AA7F3D2A003}">
+  <ds:schemaRefs>
+    <ds:schemaRef ds:uri="http://schemas.microsoft.com/sharepoint/v3/contenttype/forms"/>
+  </ds:schemaRefs>
+</ds:datastoreItem>
 </file>
 
-<file path=customXml/itemProps1.xml><?xml version="1.0" encoding="utf-8"?>
-<ds:datastoreItem xmlns:ds="http://schemas.openxmlformats.org/officeDocument/2006/customXml" ds:itemID="{89FF38D1-6CED-4166-BF3F-322B2ACBD299}">
+<file path=customXml/itemProps4.xml><?xml version="1.0" encoding="utf-8"?>
+<ds:datastoreItem xmlns:ds="http://schemas.openxmlformats.org/officeDocument/2006/customXml" ds:itemID="{DED9EAF2-8E76-46BC-B553-06FB6725EB89}">
   <ds:schemaRefs>
     <ds:schemaRef ds:uri="http://schemas.microsoft.com/office/2006/metadata/contentType"/>
     <ds:schemaRef ds:uri="http://schemas.microsoft.com/office/2006/metadata/properties/metaAttributes"/>
@@ -14133,33 +14181,6 @@
 </ds:datastoreItem>
 </file>
 
-<file path=customXml/itemProps2.xml><?xml version="1.0" encoding="utf-8"?>
-<ds:datastoreItem xmlns:ds="http://schemas.openxmlformats.org/officeDocument/2006/customXml" ds:itemID="{88461FB1-FDEA-4B0C-B768-7A29B8582256}">
-  <ds:schemaRefs>
-    <ds:schemaRef ds:uri="http://schemas.openxmlformats.org/officeDocument/2006/bibliography"/>
-  </ds:schemaRefs>
-</ds:datastoreItem>
-</file>
-
-<file path=customXml/itemProps3.xml><?xml version="1.0" encoding="utf-8"?>
-<ds:datastoreItem xmlns:ds="http://schemas.openxmlformats.org/officeDocument/2006/customXml" ds:itemID="{4BD6B6CD-5E4A-472A-8346-5FC12C5382B7}">
-  <ds:schemaRefs>
-    <ds:schemaRef ds:uri="http://schemas.microsoft.com/office/2006/metadata/properties"/>
-    <ds:schemaRef ds:uri="http://schemas.microsoft.com/office/infopath/2007/PartnerControls"/>
-    <ds:schemaRef ds:uri="82151b75-111b-4cde-b66a-26bbd1d19664"/>
-    <ds:schemaRef ds:uri="b7b3ff46-887a-48e8-bc41-4dde4d679916"/>
-  </ds:schemaRefs>
-</ds:datastoreItem>
-</file>
-
-<file path=customXml/itemProps4.xml><?xml version="1.0" encoding="utf-8"?>
-<ds:datastoreItem xmlns:ds="http://schemas.openxmlformats.org/officeDocument/2006/customXml" ds:itemID="{179FC9BC-D3BE-4788-8B0A-0AA7F3D2A003}">
-  <ds:schemaRefs>
-    <ds:schemaRef ds:uri="http://schemas.microsoft.com/sharepoint/v3/contenttype/forms"/>
-  </ds:schemaRefs>
-</ds:datastoreItem>
-</file>
-
 <file path=docMetadata/LabelInfo.xml><?xml version="1.0" encoding="utf-8"?>
 <clbl:labelList xmlns:clbl="http://schemas.microsoft.com/office/2020/mipLabelMetadata">
   <clbl:label id="{5b771df3-ad57-4d65-99cc-395b22bf1203}" enabled="0" method="" siteId="{5b771df3-ad57-4d65-99cc-395b22bf1203}" removed="1"/>

</xml_diff>